<commit_message>
Add dark mode toggle, typewriter effect, scroll reveal, active nav link, and EmailJS form submission
</commit_message>
<xml_diff>
--- a/OST/3CS502ME24_OST_LOP.docx
+++ b/OST/3CS502ME24_OST_LOP.docx
@@ -1,6 +1,6 @@
 
 <file path=word/document.xml><?xml version="1.0" encoding="utf-8"?>
-<w:document xmlns:wpc="http://schemas.microsoft.com/office/word/2010/wordprocessingCanvas" xmlns:cx="http://schemas.microsoft.com/office/drawing/2014/chartex" xmlns:cx1="http://schemas.microsoft.com/office/drawing/2015/9/8/chartex" xmlns:cx2="http://schemas.microsoft.com/office/drawing/2015/10/21/chartex" xmlns:cx3="http://schemas.microsoft.com/office/drawing/2016/5/9/chartex" xmlns:cx4="http://schemas.microsoft.com/office/drawing/2016/5/10/chartex" xmlns:cx5="http://schemas.microsoft.com/office/drawing/2016/5/11/chartex" xmlns:cx6="http://schemas.microsoft.com/office/drawing/2016/5/12/chartex" xmlns:cx7="http://schemas.microsoft.com/office/drawing/2016/5/13/chartex" xmlns:cx8="http://schemas.microsoft.com/office/drawing/2016/5/14/chartex" xmlns:mc="http://schemas.openxmlformats.org/markup-compatibility/2006" xmlns:aink="http://schemas.microsoft.com/office/drawing/2016/ink" xmlns:am3d="http://schemas.microsoft.com/office/drawing/2017/model3d" xmlns:o="urn:schemas-microsoft-com:office:office" xmlns:r="http://schemas.openxmlformats.org/officeDocument/2006/relationships" xmlns:m="http://schemas.openxmlformats.org/officeDocument/2006/math" xmlns:v="urn:schemas-microsoft-com:vml" xmlns:wp14="http://schemas.microsoft.com/office/word/2010/wordprocessingDrawing" xmlns:wp="http://schemas.openxmlformats.org/drawingml/2006/wordprocessingDrawing" xmlns:w10="urn:schemas-microsoft-com:office:word" xmlns:w="http://schemas.openxmlformats.org/wordprocessingml/2006/main" xmlns:w14="http://schemas.microsoft.com/office/word/2010/wordml" xmlns:w15="http://schemas.microsoft.com/office/word/2012/wordml" xmlns:w16cex="http://schemas.microsoft.com/office/word/2018/wordml/cex" xmlns:w16cid="http://schemas.microsoft.com/office/word/2016/wordml/cid" xmlns:w16="http://schemas.microsoft.com/office/word/2018/wordml" xmlns:w16sdtdh="http://schemas.microsoft.com/office/word/2020/wordml/sdtdatahash" xmlns:w16se="http://schemas.microsoft.com/office/word/2015/wordml/symex" xmlns:wpg="http://schemas.microsoft.com/office/word/2010/wordprocessingGroup" xmlns:wpi="http://schemas.microsoft.com/office/word/2010/wordprocessingInk" xmlns:wne="http://schemas.microsoft.com/office/word/2006/wordml" xmlns:wps="http://schemas.microsoft.com/office/word/2010/wordprocessingShape" mc:Ignorable="w14 w15 w16se w16cid w16 w16cex w16sdtdh wp14">
+<w:document xmlns:wpc="http://schemas.microsoft.com/office/word/2010/wordprocessingCanvas" xmlns:cx="http://schemas.microsoft.com/office/drawing/2014/chartex" xmlns:cx1="http://schemas.microsoft.com/office/drawing/2015/9/8/chartex" xmlns:cx2="http://schemas.microsoft.com/office/drawing/2015/10/21/chartex" xmlns:cx3="http://schemas.microsoft.com/office/drawing/2016/5/9/chartex" xmlns:cx4="http://schemas.microsoft.com/office/drawing/2016/5/10/chartex" xmlns:cx5="http://schemas.microsoft.com/office/drawing/2016/5/11/chartex" xmlns:cx6="http://schemas.microsoft.com/office/drawing/2016/5/12/chartex" xmlns:cx7="http://schemas.microsoft.com/office/drawing/2016/5/13/chartex" xmlns:cx8="http://schemas.microsoft.com/office/drawing/2016/5/14/chartex" xmlns:mc="http://schemas.openxmlformats.org/markup-compatibility/2006" xmlns:aink="http://schemas.microsoft.com/office/drawing/2016/ink" xmlns:am3d="http://schemas.microsoft.com/office/drawing/2017/model3d" xmlns:o="urn:schemas-microsoft-com:office:office" xmlns:oel="http://schemas.microsoft.com/office/2019/extlst" xmlns:r="http://schemas.openxmlformats.org/officeDocument/2006/relationships" xmlns:m="http://schemas.openxmlformats.org/officeDocument/2006/math" xmlns:v="urn:schemas-microsoft-com:vml" xmlns:wp14="http://schemas.microsoft.com/office/word/2010/wordprocessingDrawing" xmlns:wp="http://schemas.openxmlformats.org/drawingml/2006/wordprocessingDrawing" xmlns:w10="urn:schemas-microsoft-com:office:word" xmlns:w="http://schemas.openxmlformats.org/wordprocessingml/2006/main" xmlns:w14="http://schemas.microsoft.com/office/word/2010/wordml" xmlns:w15="http://schemas.microsoft.com/office/word/2012/wordml" xmlns:w16cei="http://schemas.microsoft.com/office/word/2026/wordml/cei" xmlns:w16cex="http://schemas.microsoft.com/office/word/2018/wordml/cex" xmlns:w16cid="http://schemas.microsoft.com/office/word/2016/wordml/cid" xmlns:w16="http://schemas.microsoft.com/office/word/2018/wordml" xmlns:w16du="http://schemas.microsoft.com/office/word/2023/wordml/word16du" xmlns:w16sdtdh="http://schemas.microsoft.com/office/word/2020/wordml/sdtdatahash" xmlns:w16sdtfl="http://schemas.microsoft.com/office/word/2024/wordml/sdtformatlock" xmlns:w16se="http://schemas.microsoft.com/office/word/2015/wordml/symex" xmlns:wpg="http://schemas.microsoft.com/office/word/2010/wordprocessingGroup" xmlns:wpi="http://schemas.microsoft.com/office/word/2010/wordprocessingInk" xmlns:wne="http://schemas.microsoft.com/office/word/2006/wordml" xmlns:wps="http://schemas.microsoft.com/office/word/2010/wordprocessingShape" mc:Ignorable="w14 w15 w16se w16cid w16 w16cex w16sdtdh w16sdtfl w16du wp14">
   <w:body>
     <w:p>
       <w:pPr>
@@ -13,7 +13,6 @@
           <w:szCs w:val="28"/>
         </w:rPr>
       </w:pPr>
-      <w:proofErr w:type="spellStart"/>
       <w:r>
         <w:rPr>
           <w:rFonts w:ascii="Times New Roman" w:eastAsia="Times New Roman" w:hAnsi="Times New Roman" w:cs="Times New Roman"/>
@@ -21,9 +20,8 @@
           <w:sz w:val="28"/>
           <w:szCs w:val="28"/>
         </w:rPr>
-        <w:t>Nirma</w:t>
+        <w:t xml:space="preserve">            </w:t>
       </w:r>
-      <w:proofErr w:type="spellEnd"/>
       <w:r>
         <w:rPr>
           <w:rFonts w:ascii="Times New Roman" w:eastAsia="Times New Roman" w:hAnsi="Times New Roman" w:cs="Times New Roman"/>
@@ -31,7 +29,7 @@
           <w:sz w:val="28"/>
           <w:szCs w:val="28"/>
         </w:rPr>
-        <w:t xml:space="preserve"> University</w:t>
+        <w:t>Nirma University</w:t>
       </w:r>
     </w:p>
     <w:p>
@@ -66,7 +64,6 @@
           <w:szCs w:val="28"/>
         </w:rPr>
       </w:pPr>
-      <w:proofErr w:type="gramStart"/>
       <w:r>
         <w:rPr>
           <w:rFonts w:ascii="Times New Roman" w:eastAsia="Times New Roman" w:hAnsi="Times New Roman" w:cs="Times New Roman"/>
@@ -92,17 +89,7 @@
           <w:sz w:val="28"/>
           <w:szCs w:val="28"/>
         </w:rPr>
-        <w:t>ource</w:t>
-      </w:r>
-      <w:proofErr w:type="gramEnd"/>
-      <w:r>
-        <w:rPr>
-          <w:rFonts w:ascii="Times New Roman" w:eastAsia="Times New Roman" w:hAnsi="Times New Roman" w:cs="Times New Roman"/>
-          <w:b/>
-          <w:sz w:val="28"/>
-          <w:szCs w:val="28"/>
-        </w:rPr>
-        <w:t xml:space="preserve"> </w:t>
+        <w:t xml:space="preserve">ource </w:t>
       </w:r>
       <w:r>
         <w:rPr>
@@ -170,7 +157,6 @@
         </w:rPr>
         <w:t xml:space="preserve">List of </w:t>
       </w:r>
-      <w:proofErr w:type="spellStart"/>
       <w:r>
         <w:rPr>
           <w:rFonts w:ascii="Times New Roman" w:eastAsia="Times New Roman" w:hAnsi="Times New Roman" w:cs="Times New Roman"/>
@@ -180,7 +166,6 @@
         </w:rPr>
         <w:t>Practicals</w:t>
       </w:r>
-      <w:proofErr w:type="spellEnd"/>
     </w:p>
     <w:tbl>
       <w:tblPr>
@@ -210,7 +195,6 @@
         <w:tc>
           <w:tcPr>
             <w:tcW w:w="675" w:type="dxa"/>
-            <w:shd w:val="clear" w:color="auto" w:fill="auto"/>
             <w:tcMar>
               <w:left w:w="98" w:type="dxa"/>
             </w:tcMar>
@@ -250,7 +234,6 @@
         <w:tc>
           <w:tcPr>
             <w:tcW w:w="7395" w:type="dxa"/>
-            <w:shd w:val="clear" w:color="auto" w:fill="auto"/>
             <w:tcMar>
               <w:left w:w="0" w:type="dxa"/>
             </w:tcMar>
@@ -288,7 +271,6 @@
         <w:tc>
           <w:tcPr>
             <w:tcW w:w="1003" w:type="dxa"/>
-            <w:shd w:val="clear" w:color="auto" w:fill="auto"/>
             <w:tcMar>
               <w:left w:w="0" w:type="dxa"/>
             </w:tcMar>
@@ -364,7 +346,6 @@
         <w:tc>
           <w:tcPr>
             <w:tcW w:w="675" w:type="dxa"/>
-            <w:shd w:val="clear" w:color="auto" w:fill="auto"/>
             <w:tcMar>
               <w:top w:w="0" w:type="dxa"/>
               <w:left w:w="98" w:type="dxa"/>
@@ -397,7 +378,6 @@
         <w:tc>
           <w:tcPr>
             <w:tcW w:w="7395" w:type="dxa"/>
-            <w:shd w:val="clear" w:color="auto" w:fill="auto"/>
             <w:tcMar>
               <w:top w:w="0" w:type="dxa"/>
               <w:left w:w="0" w:type="dxa"/>
@@ -421,7 +401,6 @@
         <w:tc>
           <w:tcPr>
             <w:tcW w:w="1003" w:type="dxa"/>
-            <w:shd w:val="clear" w:color="auto" w:fill="auto"/>
             <w:tcMar>
               <w:top w:w="0" w:type="dxa"/>
               <w:left w:w="0" w:type="dxa"/>
@@ -491,7 +470,6 @@
         <w:tc>
           <w:tcPr>
             <w:tcW w:w="675" w:type="dxa"/>
-            <w:shd w:val="clear" w:color="auto" w:fill="auto"/>
             <w:tcMar>
               <w:top w:w="0" w:type="dxa"/>
               <w:left w:w="98" w:type="dxa"/>
@@ -524,7 +502,6 @@
         <w:tc>
           <w:tcPr>
             <w:tcW w:w="7395" w:type="dxa"/>
-            <w:shd w:val="clear" w:color="auto" w:fill="auto"/>
             <w:tcMar>
               <w:top w:w="0" w:type="dxa"/>
               <w:left w:w="0" w:type="dxa"/>
@@ -556,7 +533,6 @@
         <w:tc>
           <w:tcPr>
             <w:tcW w:w="1003" w:type="dxa"/>
-            <w:shd w:val="clear" w:color="auto" w:fill="auto"/>
             <w:tcMar>
               <w:top w:w="0" w:type="dxa"/>
               <w:left w:w="0" w:type="dxa"/>
@@ -626,7 +602,6 @@
         <w:tc>
           <w:tcPr>
             <w:tcW w:w="675" w:type="dxa"/>
-            <w:shd w:val="clear" w:color="auto" w:fill="auto"/>
             <w:tcMar>
               <w:top w:w="0" w:type="dxa"/>
               <w:left w:w="98" w:type="dxa"/>
@@ -659,7 +634,6 @@
         <w:tc>
           <w:tcPr>
             <w:tcW w:w="7395" w:type="dxa"/>
-            <w:shd w:val="clear" w:color="auto" w:fill="auto"/>
             <w:tcMar>
               <w:top w:w="0" w:type="dxa"/>
               <w:left w:w="0" w:type="dxa"/>
@@ -683,7 +657,6 @@
         <w:tc>
           <w:tcPr>
             <w:tcW w:w="1003" w:type="dxa"/>
-            <w:shd w:val="clear" w:color="auto" w:fill="auto"/>
             <w:tcMar>
               <w:top w:w="0" w:type="dxa"/>
               <w:left w:w="0" w:type="dxa"/>
@@ -753,7 +726,6 @@
         <w:tc>
           <w:tcPr>
             <w:tcW w:w="675" w:type="dxa"/>
-            <w:shd w:val="clear" w:color="auto" w:fill="auto"/>
             <w:tcMar>
               <w:top w:w="0" w:type="dxa"/>
               <w:left w:w="98" w:type="dxa"/>
@@ -786,7 +758,6 @@
         <w:tc>
           <w:tcPr>
             <w:tcW w:w="7395" w:type="dxa"/>
-            <w:shd w:val="clear" w:color="auto" w:fill="auto"/>
             <w:tcMar>
               <w:top w:w="0" w:type="dxa"/>
               <w:left w:w="0" w:type="dxa"/>
@@ -803,38 +774,13 @@
               </w:rPr>
             </w:pPr>
             <w:r>
-              <w:t xml:space="preserve">Install </w:t>
-            </w:r>
-            <w:proofErr w:type="spellStart"/>
-            <w:r>
-              <w:t>Jupyter</w:t>
-            </w:r>
-            <w:proofErr w:type="spellEnd"/>
-            <w:r>
-              <w:t xml:space="preserve"> Notebook and Data </w:t>
-            </w:r>
-            <w:proofErr w:type="spellStart"/>
-            <w:r>
-              <w:t>Visualisation</w:t>
-            </w:r>
-            <w:proofErr w:type="spellEnd"/>
-            <w:r>
-              <w:t xml:space="preserve"> with Matplotlib: Use Matplotlib to create various data </w:t>
-            </w:r>
-            <w:proofErr w:type="spellStart"/>
-            <w:r>
-              <w:t>visualisations</w:t>
-            </w:r>
-            <w:proofErr w:type="spellEnd"/>
-            <w:r>
-              <w:t>, such as bar charts, scatter plots, and histograms.</w:t>
+              <w:t>Install Jupyter Notebook and Data Visualisation with Matplotlib: Use Matplotlib to create various data visualisations, such as bar charts, scatter plots, and histograms.</w:t>
             </w:r>
           </w:p>
         </w:tc>
         <w:tc>
           <w:tcPr>
             <w:tcW w:w="1003" w:type="dxa"/>
-            <w:shd w:val="clear" w:color="auto" w:fill="auto"/>
             <w:tcMar>
               <w:top w:w="0" w:type="dxa"/>
               <w:left w:w="0" w:type="dxa"/>
@@ -904,7 +850,6 @@
         <w:tc>
           <w:tcPr>
             <w:tcW w:w="675" w:type="dxa"/>
-            <w:shd w:val="clear" w:color="auto" w:fill="auto"/>
             <w:tcMar>
               <w:top w:w="0" w:type="dxa"/>
               <w:left w:w="98" w:type="dxa"/>
@@ -937,7 +882,6 @@
         <w:tc>
           <w:tcPr>
             <w:tcW w:w="7395" w:type="dxa"/>
-            <w:shd w:val="clear" w:color="auto" w:fill="auto"/>
             <w:tcMar>
               <w:top w:w="0" w:type="dxa"/>
               <w:left w:w="0" w:type="dxa"/>
@@ -961,7 +905,6 @@
         <w:tc>
           <w:tcPr>
             <w:tcW w:w="1003" w:type="dxa"/>
-            <w:shd w:val="clear" w:color="auto" w:fill="auto"/>
             <w:tcMar>
               <w:top w:w="0" w:type="dxa"/>
               <w:left w:w="0" w:type="dxa"/>
@@ -1031,7 +974,6 @@
         <w:tc>
           <w:tcPr>
             <w:tcW w:w="675" w:type="dxa"/>
-            <w:shd w:val="clear" w:color="auto" w:fill="auto"/>
             <w:tcMar>
               <w:top w:w="0" w:type="dxa"/>
               <w:left w:w="98" w:type="dxa"/>
@@ -1064,7 +1006,6 @@
         <w:tc>
           <w:tcPr>
             <w:tcW w:w="7395" w:type="dxa"/>
-            <w:shd w:val="clear" w:color="auto" w:fill="auto"/>
             <w:tcMar>
               <w:top w:w="0" w:type="dxa"/>
               <w:left w:w="0" w:type="dxa"/>
@@ -1088,7 +1029,6 @@
         <w:tc>
           <w:tcPr>
             <w:tcW w:w="1003" w:type="dxa"/>
-            <w:shd w:val="clear" w:color="auto" w:fill="auto"/>
             <w:tcMar>
               <w:top w:w="0" w:type="dxa"/>
               <w:left w:w="0" w:type="dxa"/>
@@ -1158,7 +1098,6 @@
         <w:tc>
           <w:tcPr>
             <w:tcW w:w="675" w:type="dxa"/>
-            <w:shd w:val="clear" w:color="auto" w:fill="auto"/>
             <w:tcMar>
               <w:top w:w="0" w:type="dxa"/>
               <w:left w:w="98" w:type="dxa"/>
@@ -1191,7 +1130,6 @@
         <w:tc>
           <w:tcPr>
             <w:tcW w:w="7395" w:type="dxa"/>
-            <w:shd w:val="clear" w:color="auto" w:fill="auto"/>
             <w:tcMar>
               <w:top w:w="0" w:type="dxa"/>
               <w:left w:w="0" w:type="dxa"/>
@@ -1215,7 +1153,6 @@
         <w:tc>
           <w:tcPr>
             <w:tcW w:w="1003" w:type="dxa"/>
-            <w:shd w:val="clear" w:color="auto" w:fill="auto"/>
             <w:tcMar>
               <w:top w:w="0" w:type="dxa"/>
               <w:left w:w="0" w:type="dxa"/>
@@ -1285,7 +1222,6 @@
         <w:tc>
           <w:tcPr>
             <w:tcW w:w="675" w:type="dxa"/>
-            <w:shd w:val="clear" w:color="auto" w:fill="auto"/>
             <w:tcMar>
               <w:top w:w="0" w:type="dxa"/>
               <w:left w:w="98" w:type="dxa"/>
@@ -1318,7 +1254,6 @@
         <w:tc>
           <w:tcPr>
             <w:tcW w:w="7395" w:type="dxa"/>
-            <w:shd w:val="clear" w:color="auto" w:fill="auto"/>
             <w:tcMar>
               <w:top w:w="0" w:type="dxa"/>
               <w:left w:w="0" w:type="dxa"/>
@@ -1335,22 +1270,13 @@
               </w:rPr>
             </w:pPr>
             <w:r>
-              <w:t xml:space="preserve">Develop a </w:t>
-            </w:r>
-            <w:proofErr w:type="spellStart"/>
-            <w:r>
-              <w:t>Jupyter</w:t>
-            </w:r>
-            <w:proofErr w:type="spellEnd"/>
-            <w:r>
-              <w:t xml:space="preserve"> notebook to acquire foundational skills in data manipulation using Pandas, encompassing data loading, cleaning, and exploration techniques.</w:t>
+              <w:t>Develop a Jupyter notebook to acquire foundational skills in data manipulation using Pandas, encompassing data loading, cleaning, and exploration techniques.</w:t>
             </w:r>
           </w:p>
         </w:tc>
         <w:tc>
           <w:tcPr>
             <w:tcW w:w="1003" w:type="dxa"/>
-            <w:shd w:val="clear" w:color="auto" w:fill="auto"/>
             <w:tcMar>
               <w:top w:w="0" w:type="dxa"/>
               <w:left w:w="0" w:type="dxa"/>
@@ -1424,7 +1350,6 @@
         <w:tc>
           <w:tcPr>
             <w:tcW w:w="675" w:type="dxa"/>
-            <w:shd w:val="clear" w:color="auto" w:fill="auto"/>
             <w:tcMar>
               <w:top w:w="0" w:type="dxa"/>
               <w:left w:w="98" w:type="dxa"/>
@@ -1457,7 +1382,6 @@
         <w:tc>
           <w:tcPr>
             <w:tcW w:w="7395" w:type="dxa"/>
-            <w:shd w:val="clear" w:color="auto" w:fill="auto"/>
             <w:tcMar>
               <w:top w:w="0" w:type="dxa"/>
               <w:left w:w="0" w:type="dxa"/>
@@ -1484,7 +1408,6 @@
         <w:tc>
           <w:tcPr>
             <w:tcW w:w="1003" w:type="dxa"/>
-            <w:shd w:val="clear" w:color="auto" w:fill="auto"/>
             <w:tcMar>
               <w:top w:w="0" w:type="dxa"/>
               <w:left w:w="0" w:type="dxa"/>
@@ -1558,7 +1481,6 @@
         <w:tc>
           <w:tcPr>
             <w:tcW w:w="675" w:type="dxa"/>
-            <w:shd w:val="clear" w:color="auto" w:fill="auto"/>
             <w:tcMar>
               <w:top w:w="0" w:type="dxa"/>
               <w:left w:w="98" w:type="dxa"/>
@@ -1591,7 +1513,6 @@
         <w:tc>
           <w:tcPr>
             <w:tcW w:w="7395" w:type="dxa"/>
-            <w:shd w:val="clear" w:color="auto" w:fill="auto"/>
             <w:tcMar>
               <w:top w:w="0" w:type="dxa"/>
               <w:left w:w="0" w:type="dxa"/>
@@ -1608,22 +1529,13 @@
               </w:rPr>
             </w:pPr>
             <w:r>
-              <w:t xml:space="preserve">Develop a Python application to interact with </w:t>
-            </w:r>
-            <w:proofErr w:type="gramStart"/>
-            <w:r>
-              <w:t>a</w:t>
-            </w:r>
-            <w:proofErr w:type="gramEnd"/>
-            <w:r>
-              <w:t xml:space="preserve"> SQLite database, implementing fundamental CRUD (Create, Read, Update, Delete) operations.</w:t>
+              <w:t>Develop a Python application to interact with a SQLite database, implementing fundamental CRUD (Create, Read, Update, Delete) operations.</w:t>
             </w:r>
           </w:p>
         </w:tc>
         <w:tc>
           <w:tcPr>
             <w:tcW w:w="1003" w:type="dxa"/>
-            <w:shd w:val="clear" w:color="auto" w:fill="auto"/>
             <w:tcMar>
               <w:top w:w="0" w:type="dxa"/>
               <w:left w:w="0" w:type="dxa"/>
@@ -1706,7 +1618,7 @@
 </file>
 
 <file path=word/endnotes.xml><?xml version="1.0" encoding="utf-8"?>
-<w:endnotes xmlns:wpc="http://schemas.microsoft.com/office/word/2010/wordprocessingCanvas" xmlns:cx="http://schemas.microsoft.com/office/drawing/2014/chartex" xmlns:cx1="http://schemas.microsoft.com/office/drawing/2015/9/8/chartex" xmlns:cx2="http://schemas.microsoft.com/office/drawing/2015/10/21/chartex" xmlns:cx3="http://schemas.microsoft.com/office/drawing/2016/5/9/chartex" xmlns:cx4="http://schemas.microsoft.com/office/drawing/2016/5/10/chartex" xmlns:cx5="http://schemas.microsoft.com/office/drawing/2016/5/11/chartex" xmlns:cx6="http://schemas.microsoft.com/office/drawing/2016/5/12/chartex" xmlns:cx7="http://schemas.microsoft.com/office/drawing/2016/5/13/chartex" xmlns:cx8="http://schemas.microsoft.com/office/drawing/2016/5/14/chartex" xmlns:mc="http://schemas.openxmlformats.org/markup-compatibility/2006" xmlns:aink="http://schemas.microsoft.com/office/drawing/2016/ink" xmlns:am3d="http://schemas.microsoft.com/office/drawing/2017/model3d" xmlns:o="urn:schemas-microsoft-com:office:office" xmlns:r="http://schemas.openxmlformats.org/officeDocument/2006/relationships" xmlns:m="http://schemas.openxmlformats.org/officeDocument/2006/math" xmlns:v="urn:schemas-microsoft-com:vml" xmlns:wp14="http://schemas.microsoft.com/office/word/2010/wordprocessingDrawing" xmlns:wp="http://schemas.openxmlformats.org/drawingml/2006/wordprocessingDrawing" xmlns:w10="urn:schemas-microsoft-com:office:word" xmlns:w="http://schemas.openxmlformats.org/wordprocessingml/2006/main" xmlns:w14="http://schemas.microsoft.com/office/word/2010/wordml" xmlns:w15="http://schemas.microsoft.com/office/word/2012/wordml" xmlns:w16cex="http://schemas.microsoft.com/office/word/2018/wordml/cex" xmlns:w16cid="http://schemas.microsoft.com/office/word/2016/wordml/cid" xmlns:w16="http://schemas.microsoft.com/office/word/2018/wordml" xmlns:w16sdtdh="http://schemas.microsoft.com/office/word/2020/wordml/sdtdatahash" xmlns:w16se="http://schemas.microsoft.com/office/word/2015/wordml/symex" xmlns:wpg="http://schemas.microsoft.com/office/word/2010/wordprocessingGroup" xmlns:wpi="http://schemas.microsoft.com/office/word/2010/wordprocessingInk" xmlns:wne="http://schemas.microsoft.com/office/word/2006/wordml" xmlns:wps="http://schemas.microsoft.com/office/word/2010/wordprocessingShape" mc:Ignorable="w14 w15 w16se w16cid w16 w16cex w16sdtdh wp14">
+<w:endnotes xmlns:wpc="http://schemas.microsoft.com/office/word/2010/wordprocessingCanvas" xmlns:cx="http://schemas.microsoft.com/office/drawing/2014/chartex" xmlns:cx1="http://schemas.microsoft.com/office/drawing/2015/9/8/chartex" xmlns:cx2="http://schemas.microsoft.com/office/drawing/2015/10/21/chartex" xmlns:cx3="http://schemas.microsoft.com/office/drawing/2016/5/9/chartex" xmlns:cx4="http://schemas.microsoft.com/office/drawing/2016/5/10/chartex" xmlns:cx5="http://schemas.microsoft.com/office/drawing/2016/5/11/chartex" xmlns:cx6="http://schemas.microsoft.com/office/drawing/2016/5/12/chartex" xmlns:cx7="http://schemas.microsoft.com/office/drawing/2016/5/13/chartex" xmlns:cx8="http://schemas.microsoft.com/office/drawing/2016/5/14/chartex" xmlns:mc="http://schemas.openxmlformats.org/markup-compatibility/2006" xmlns:aink="http://schemas.microsoft.com/office/drawing/2016/ink" xmlns:am3d="http://schemas.microsoft.com/office/drawing/2017/model3d" xmlns:o="urn:schemas-microsoft-com:office:office" xmlns:oel="http://schemas.microsoft.com/office/2019/extlst" xmlns:r="http://schemas.openxmlformats.org/officeDocument/2006/relationships" xmlns:m="http://schemas.openxmlformats.org/officeDocument/2006/math" xmlns:v="urn:schemas-microsoft-com:vml" xmlns:wp14="http://schemas.microsoft.com/office/word/2010/wordprocessingDrawing" xmlns:wp="http://schemas.openxmlformats.org/drawingml/2006/wordprocessingDrawing" xmlns:w10="urn:schemas-microsoft-com:office:word" xmlns:w="http://schemas.openxmlformats.org/wordprocessingml/2006/main" xmlns:w14="http://schemas.microsoft.com/office/word/2010/wordml" xmlns:w15="http://schemas.microsoft.com/office/word/2012/wordml" xmlns:w16cei="http://schemas.microsoft.com/office/word/2026/wordml/cei" xmlns:w16cex="http://schemas.microsoft.com/office/word/2018/wordml/cex" xmlns:w16cid="http://schemas.microsoft.com/office/word/2016/wordml/cid" xmlns:w16="http://schemas.microsoft.com/office/word/2018/wordml" xmlns:w16du="http://schemas.microsoft.com/office/word/2023/wordml/word16du" xmlns:w16sdtdh="http://schemas.microsoft.com/office/word/2020/wordml/sdtdatahash" xmlns:w16sdtfl="http://schemas.microsoft.com/office/word/2024/wordml/sdtformatlock" xmlns:w16se="http://schemas.microsoft.com/office/word/2015/wordml/symex" xmlns:wpg="http://schemas.microsoft.com/office/word/2010/wordprocessingGroup" xmlns:wpi="http://schemas.microsoft.com/office/word/2010/wordprocessingInk" xmlns:wne="http://schemas.microsoft.com/office/word/2006/wordml" xmlns:wps="http://schemas.microsoft.com/office/word/2010/wordprocessingShape" mc:Ignorable="w14 w15 w16se w16cid w16 w16cex w16sdtdh w16sdtfl w16du wp14">
   <w:endnote w:type="separator" w:id="-1">
     <w:p>
       <w:pPr>
@@ -1731,7 +1643,7 @@
 </file>
 
 <file path=word/footer1.xml><?xml version="1.0" encoding="utf-8"?>
-<w:ftr xmlns:wpc="http://schemas.microsoft.com/office/word/2010/wordprocessingCanvas" xmlns:cx="http://schemas.microsoft.com/office/drawing/2014/chartex" xmlns:cx1="http://schemas.microsoft.com/office/drawing/2015/9/8/chartex" xmlns:cx2="http://schemas.microsoft.com/office/drawing/2015/10/21/chartex" xmlns:cx3="http://schemas.microsoft.com/office/drawing/2016/5/9/chartex" xmlns:cx4="http://schemas.microsoft.com/office/drawing/2016/5/10/chartex" xmlns:cx5="http://schemas.microsoft.com/office/drawing/2016/5/11/chartex" xmlns:cx6="http://schemas.microsoft.com/office/drawing/2016/5/12/chartex" xmlns:cx7="http://schemas.microsoft.com/office/drawing/2016/5/13/chartex" xmlns:cx8="http://schemas.microsoft.com/office/drawing/2016/5/14/chartex" xmlns:mc="http://schemas.openxmlformats.org/markup-compatibility/2006" xmlns:aink="http://schemas.microsoft.com/office/drawing/2016/ink" xmlns:am3d="http://schemas.microsoft.com/office/drawing/2017/model3d" xmlns:o="urn:schemas-microsoft-com:office:office" xmlns:r="http://schemas.openxmlformats.org/officeDocument/2006/relationships" xmlns:m="http://schemas.openxmlformats.org/officeDocument/2006/math" xmlns:v="urn:schemas-microsoft-com:vml" xmlns:wp14="http://schemas.microsoft.com/office/word/2010/wordprocessingDrawing" xmlns:wp="http://schemas.openxmlformats.org/drawingml/2006/wordprocessingDrawing" xmlns:w10="urn:schemas-microsoft-com:office:word" xmlns:w="http://schemas.openxmlformats.org/wordprocessingml/2006/main" xmlns:w14="http://schemas.microsoft.com/office/word/2010/wordml" xmlns:w15="http://schemas.microsoft.com/office/word/2012/wordml" xmlns:w16cex="http://schemas.microsoft.com/office/word/2018/wordml/cex" xmlns:w16cid="http://schemas.microsoft.com/office/word/2016/wordml/cid" xmlns:w16="http://schemas.microsoft.com/office/word/2018/wordml" xmlns:w16sdtdh="http://schemas.microsoft.com/office/word/2020/wordml/sdtdatahash" xmlns:w16se="http://schemas.microsoft.com/office/word/2015/wordml/symex" xmlns:wpg="http://schemas.microsoft.com/office/word/2010/wordprocessingGroup" xmlns:wpi="http://schemas.microsoft.com/office/word/2010/wordprocessingInk" xmlns:wne="http://schemas.microsoft.com/office/word/2006/wordml" xmlns:wps="http://schemas.microsoft.com/office/word/2010/wordprocessingShape" mc:Ignorable="w14 w15 w16se w16cid w16 w16cex w16sdtdh wp14">
+<w:ftr xmlns:wpc="http://schemas.microsoft.com/office/word/2010/wordprocessingCanvas" xmlns:cx="http://schemas.microsoft.com/office/drawing/2014/chartex" xmlns:cx1="http://schemas.microsoft.com/office/drawing/2015/9/8/chartex" xmlns:cx2="http://schemas.microsoft.com/office/drawing/2015/10/21/chartex" xmlns:cx3="http://schemas.microsoft.com/office/drawing/2016/5/9/chartex" xmlns:cx4="http://schemas.microsoft.com/office/drawing/2016/5/10/chartex" xmlns:cx5="http://schemas.microsoft.com/office/drawing/2016/5/11/chartex" xmlns:cx6="http://schemas.microsoft.com/office/drawing/2016/5/12/chartex" xmlns:cx7="http://schemas.microsoft.com/office/drawing/2016/5/13/chartex" xmlns:cx8="http://schemas.microsoft.com/office/drawing/2016/5/14/chartex" xmlns:mc="http://schemas.openxmlformats.org/markup-compatibility/2006" xmlns:aink="http://schemas.microsoft.com/office/drawing/2016/ink" xmlns:am3d="http://schemas.microsoft.com/office/drawing/2017/model3d" xmlns:o="urn:schemas-microsoft-com:office:office" xmlns:oel="http://schemas.microsoft.com/office/2019/extlst" xmlns:r="http://schemas.openxmlformats.org/officeDocument/2006/relationships" xmlns:m="http://schemas.openxmlformats.org/officeDocument/2006/math" xmlns:v="urn:schemas-microsoft-com:vml" xmlns:wp14="http://schemas.microsoft.com/office/word/2010/wordprocessingDrawing" xmlns:wp="http://schemas.openxmlformats.org/drawingml/2006/wordprocessingDrawing" xmlns:w10="urn:schemas-microsoft-com:office:word" xmlns:w="http://schemas.openxmlformats.org/wordprocessingml/2006/main" xmlns:w14="http://schemas.microsoft.com/office/word/2010/wordml" xmlns:w15="http://schemas.microsoft.com/office/word/2012/wordml" xmlns:w16cei="http://schemas.microsoft.com/office/word/2026/wordml/cei" xmlns:w16cex="http://schemas.microsoft.com/office/word/2018/wordml/cex" xmlns:w16cid="http://schemas.microsoft.com/office/word/2016/wordml/cid" xmlns:w16="http://schemas.microsoft.com/office/word/2018/wordml" xmlns:w16du="http://schemas.microsoft.com/office/word/2023/wordml/word16du" xmlns:w16sdtdh="http://schemas.microsoft.com/office/word/2020/wordml/sdtdatahash" xmlns:w16sdtfl="http://schemas.microsoft.com/office/word/2024/wordml/sdtformatlock" xmlns:w16se="http://schemas.microsoft.com/office/word/2015/wordml/symex" xmlns:wpg="http://schemas.microsoft.com/office/word/2010/wordprocessingGroup" xmlns:wpi="http://schemas.microsoft.com/office/word/2010/wordprocessingInk" xmlns:wne="http://schemas.microsoft.com/office/word/2006/wordml" xmlns:wps="http://schemas.microsoft.com/office/word/2010/wordprocessingShape" mc:Ignorable="w14 w15 w16se w16cid w16 w16cex w16sdtdh w16sdtfl w16du wp14">
   <w:sdt>
     <w:sdtPr>
       <w:id w:val="1316304481"/>
@@ -1784,7 +1696,7 @@
 </file>
 
 <file path=word/footnotes.xml><?xml version="1.0" encoding="utf-8"?>
-<w:footnotes xmlns:wpc="http://schemas.microsoft.com/office/word/2010/wordprocessingCanvas" xmlns:cx="http://schemas.microsoft.com/office/drawing/2014/chartex" xmlns:cx1="http://schemas.microsoft.com/office/drawing/2015/9/8/chartex" xmlns:cx2="http://schemas.microsoft.com/office/drawing/2015/10/21/chartex" xmlns:cx3="http://schemas.microsoft.com/office/drawing/2016/5/9/chartex" xmlns:cx4="http://schemas.microsoft.com/office/drawing/2016/5/10/chartex" xmlns:cx5="http://schemas.microsoft.com/office/drawing/2016/5/11/chartex" xmlns:cx6="http://schemas.microsoft.com/office/drawing/2016/5/12/chartex" xmlns:cx7="http://schemas.microsoft.com/office/drawing/2016/5/13/chartex" xmlns:cx8="http://schemas.microsoft.com/office/drawing/2016/5/14/chartex" xmlns:mc="http://schemas.openxmlformats.org/markup-compatibility/2006" xmlns:aink="http://schemas.microsoft.com/office/drawing/2016/ink" xmlns:am3d="http://schemas.microsoft.com/office/drawing/2017/model3d" xmlns:o="urn:schemas-microsoft-com:office:office" xmlns:r="http://schemas.openxmlformats.org/officeDocument/2006/relationships" xmlns:m="http://schemas.openxmlformats.org/officeDocument/2006/math" xmlns:v="urn:schemas-microsoft-com:vml" xmlns:wp14="http://schemas.microsoft.com/office/word/2010/wordprocessingDrawing" xmlns:wp="http://schemas.openxmlformats.org/drawingml/2006/wordprocessingDrawing" xmlns:w10="urn:schemas-microsoft-com:office:word" xmlns:w="http://schemas.openxmlformats.org/wordprocessingml/2006/main" xmlns:w14="http://schemas.microsoft.com/office/word/2010/wordml" xmlns:w15="http://schemas.microsoft.com/office/word/2012/wordml" xmlns:w16cex="http://schemas.microsoft.com/office/word/2018/wordml/cex" xmlns:w16cid="http://schemas.microsoft.com/office/word/2016/wordml/cid" xmlns:w16="http://schemas.microsoft.com/office/word/2018/wordml" xmlns:w16sdtdh="http://schemas.microsoft.com/office/word/2020/wordml/sdtdatahash" xmlns:w16se="http://schemas.microsoft.com/office/word/2015/wordml/symex" xmlns:wpg="http://schemas.microsoft.com/office/word/2010/wordprocessingGroup" xmlns:wpi="http://schemas.microsoft.com/office/word/2010/wordprocessingInk" xmlns:wne="http://schemas.microsoft.com/office/word/2006/wordml" xmlns:wps="http://schemas.microsoft.com/office/word/2010/wordprocessingShape" mc:Ignorable="w14 w15 w16se w16cid w16 w16cex w16sdtdh wp14">
+<w:footnotes xmlns:wpc="http://schemas.microsoft.com/office/word/2010/wordprocessingCanvas" xmlns:cx="http://schemas.microsoft.com/office/drawing/2014/chartex" xmlns:cx1="http://schemas.microsoft.com/office/drawing/2015/9/8/chartex" xmlns:cx2="http://schemas.microsoft.com/office/drawing/2015/10/21/chartex" xmlns:cx3="http://schemas.microsoft.com/office/drawing/2016/5/9/chartex" xmlns:cx4="http://schemas.microsoft.com/office/drawing/2016/5/10/chartex" xmlns:cx5="http://schemas.microsoft.com/office/drawing/2016/5/11/chartex" xmlns:cx6="http://schemas.microsoft.com/office/drawing/2016/5/12/chartex" xmlns:cx7="http://schemas.microsoft.com/office/drawing/2016/5/13/chartex" xmlns:cx8="http://schemas.microsoft.com/office/drawing/2016/5/14/chartex" xmlns:mc="http://schemas.openxmlformats.org/markup-compatibility/2006" xmlns:aink="http://schemas.microsoft.com/office/drawing/2016/ink" xmlns:am3d="http://schemas.microsoft.com/office/drawing/2017/model3d" xmlns:o="urn:schemas-microsoft-com:office:office" xmlns:oel="http://schemas.microsoft.com/office/2019/extlst" xmlns:r="http://schemas.openxmlformats.org/officeDocument/2006/relationships" xmlns:m="http://schemas.openxmlformats.org/officeDocument/2006/math" xmlns:v="urn:schemas-microsoft-com:vml" xmlns:wp14="http://schemas.microsoft.com/office/word/2010/wordprocessingDrawing" xmlns:wp="http://schemas.openxmlformats.org/drawingml/2006/wordprocessingDrawing" xmlns:w10="urn:schemas-microsoft-com:office:word" xmlns:w="http://schemas.openxmlformats.org/wordprocessingml/2006/main" xmlns:w14="http://schemas.microsoft.com/office/word/2010/wordml" xmlns:w15="http://schemas.microsoft.com/office/word/2012/wordml" xmlns:w16cei="http://schemas.microsoft.com/office/word/2026/wordml/cei" xmlns:w16cex="http://schemas.microsoft.com/office/word/2018/wordml/cex" xmlns:w16cid="http://schemas.microsoft.com/office/word/2016/wordml/cid" xmlns:w16="http://schemas.microsoft.com/office/word/2018/wordml" xmlns:w16du="http://schemas.microsoft.com/office/word/2023/wordml/word16du" xmlns:w16sdtdh="http://schemas.microsoft.com/office/word/2020/wordml/sdtdatahash" xmlns:w16sdtfl="http://schemas.microsoft.com/office/word/2024/wordml/sdtformatlock" xmlns:w16se="http://schemas.microsoft.com/office/word/2015/wordml/symex" xmlns:wpg="http://schemas.microsoft.com/office/word/2010/wordprocessingGroup" xmlns:wpi="http://schemas.microsoft.com/office/word/2010/wordprocessingInk" xmlns:wne="http://schemas.microsoft.com/office/word/2006/wordml" xmlns:wps="http://schemas.microsoft.com/office/word/2010/wordprocessingShape" mc:Ignorable="w14 w15 w16se w16cid w16 w16cex w16sdtdh w16sdtfl w16du wp14">
   <w:footnote w:type="separator" w:id="-1">
     <w:p>
       <w:pPr>
@@ -1809,19 +1721,14 @@
 </file>
 
 <file path=word/header1.xml><?xml version="1.0" encoding="utf-8"?>
-<w:hdr xmlns:wpc="http://schemas.microsoft.com/office/word/2010/wordprocessingCanvas" xmlns:cx="http://schemas.microsoft.com/office/drawing/2014/chartex" xmlns:cx1="http://schemas.microsoft.com/office/drawing/2015/9/8/chartex" xmlns:cx2="http://schemas.microsoft.com/office/drawing/2015/10/21/chartex" xmlns:cx3="http://schemas.microsoft.com/office/drawing/2016/5/9/chartex" xmlns:cx4="http://schemas.microsoft.com/office/drawing/2016/5/10/chartex" xmlns:cx5="http://schemas.microsoft.com/office/drawing/2016/5/11/chartex" xmlns:cx6="http://schemas.microsoft.com/office/drawing/2016/5/12/chartex" xmlns:cx7="http://schemas.microsoft.com/office/drawing/2016/5/13/chartex" xmlns:cx8="http://schemas.microsoft.com/office/drawing/2016/5/14/chartex" xmlns:mc="http://schemas.openxmlformats.org/markup-compatibility/2006" xmlns:aink="http://schemas.microsoft.com/office/drawing/2016/ink" xmlns:am3d="http://schemas.microsoft.com/office/drawing/2017/model3d" xmlns:o="urn:schemas-microsoft-com:office:office" xmlns:r="http://schemas.openxmlformats.org/officeDocument/2006/relationships" xmlns:m="http://schemas.openxmlformats.org/officeDocument/2006/math" xmlns:v="urn:schemas-microsoft-com:vml" xmlns:wp14="http://schemas.microsoft.com/office/word/2010/wordprocessingDrawing" xmlns:wp="http://schemas.openxmlformats.org/drawingml/2006/wordprocessingDrawing" xmlns:w10="urn:schemas-microsoft-com:office:word" xmlns:w="http://schemas.openxmlformats.org/wordprocessingml/2006/main" xmlns:w14="http://schemas.microsoft.com/office/word/2010/wordml" xmlns:w15="http://schemas.microsoft.com/office/word/2012/wordml" xmlns:w16cex="http://schemas.microsoft.com/office/word/2018/wordml/cex" xmlns:w16cid="http://schemas.microsoft.com/office/word/2016/wordml/cid" xmlns:w16="http://schemas.microsoft.com/office/word/2018/wordml" xmlns:w16sdtdh="http://schemas.microsoft.com/office/word/2020/wordml/sdtdatahash" xmlns:w16se="http://schemas.microsoft.com/office/word/2015/wordml/symex" xmlns:wpg="http://schemas.microsoft.com/office/word/2010/wordprocessingGroup" xmlns:wpi="http://schemas.microsoft.com/office/word/2010/wordprocessingInk" xmlns:wne="http://schemas.microsoft.com/office/word/2006/wordml" xmlns:wps="http://schemas.microsoft.com/office/word/2010/wordprocessingShape" mc:Ignorable="w14 w15 w16se w16cid w16 w16cex w16sdtdh wp14">
+<w:hdr xmlns:wpc="http://schemas.microsoft.com/office/word/2010/wordprocessingCanvas" xmlns:cx="http://schemas.microsoft.com/office/drawing/2014/chartex" xmlns:cx1="http://schemas.microsoft.com/office/drawing/2015/9/8/chartex" xmlns:cx2="http://schemas.microsoft.com/office/drawing/2015/10/21/chartex" xmlns:cx3="http://schemas.microsoft.com/office/drawing/2016/5/9/chartex" xmlns:cx4="http://schemas.microsoft.com/office/drawing/2016/5/10/chartex" xmlns:cx5="http://schemas.microsoft.com/office/drawing/2016/5/11/chartex" xmlns:cx6="http://schemas.microsoft.com/office/drawing/2016/5/12/chartex" xmlns:cx7="http://schemas.microsoft.com/office/drawing/2016/5/13/chartex" xmlns:cx8="http://schemas.microsoft.com/office/drawing/2016/5/14/chartex" xmlns:mc="http://schemas.openxmlformats.org/markup-compatibility/2006" xmlns:aink="http://schemas.microsoft.com/office/drawing/2016/ink" xmlns:am3d="http://schemas.microsoft.com/office/drawing/2017/model3d" xmlns:o="urn:schemas-microsoft-com:office:office" xmlns:oel="http://schemas.microsoft.com/office/2019/extlst" xmlns:r="http://schemas.openxmlformats.org/officeDocument/2006/relationships" xmlns:m="http://schemas.openxmlformats.org/officeDocument/2006/math" xmlns:v="urn:schemas-microsoft-com:vml" xmlns:wp14="http://schemas.microsoft.com/office/word/2010/wordprocessingDrawing" xmlns:wp="http://schemas.openxmlformats.org/drawingml/2006/wordprocessingDrawing" xmlns:w10="urn:schemas-microsoft-com:office:word" xmlns:w="http://schemas.openxmlformats.org/wordprocessingml/2006/main" xmlns:w14="http://schemas.microsoft.com/office/word/2010/wordml" xmlns:w15="http://schemas.microsoft.com/office/word/2012/wordml" xmlns:w16cei="http://schemas.microsoft.com/office/word/2026/wordml/cei" xmlns:w16cex="http://schemas.microsoft.com/office/word/2018/wordml/cex" xmlns:w16cid="http://schemas.microsoft.com/office/word/2016/wordml/cid" xmlns:w16="http://schemas.microsoft.com/office/word/2018/wordml" xmlns:w16du="http://schemas.microsoft.com/office/word/2023/wordml/word16du" xmlns:w16sdtdh="http://schemas.microsoft.com/office/word/2020/wordml/sdtdatahash" xmlns:w16sdtfl="http://schemas.microsoft.com/office/word/2024/wordml/sdtformatlock" xmlns:w16se="http://schemas.microsoft.com/office/word/2015/wordml/symex" xmlns:wpg="http://schemas.microsoft.com/office/word/2010/wordprocessingGroup" xmlns:wpi="http://schemas.microsoft.com/office/word/2010/wordprocessingInk" xmlns:wne="http://schemas.microsoft.com/office/word/2006/wordml" xmlns:wps="http://schemas.microsoft.com/office/word/2010/wordprocessingShape" mc:Ignorable="w14 w15 w16se w16cid w16 w16cex w16sdtdh w16sdtfl w16du wp14">
   <w:p>
     <w:pPr>
       <w:pStyle w:val="Header"/>
       <w:jc w:val="right"/>
     </w:pPr>
-    <w:proofErr w:type="spellStart"/>
     <w:r>
-      <w:t>Nirma</w:t>
-    </w:r>
-    <w:proofErr w:type="spellEnd"/>
-    <w:r>
-      <w:t xml:space="preserve"> University</w:t>
+      <w:t>Nirma University</w:t>
     </w:r>
   </w:p>
   <w:p>
@@ -1833,7 +1740,7 @@
 </file>
 
 <file path=word/numbering.xml><?xml version="1.0" encoding="utf-8"?>
-<w:numbering xmlns:wpc="http://schemas.microsoft.com/office/word/2010/wordprocessingCanvas" xmlns:cx="http://schemas.microsoft.com/office/drawing/2014/chartex" xmlns:cx1="http://schemas.microsoft.com/office/drawing/2015/9/8/chartex" xmlns:cx2="http://schemas.microsoft.com/office/drawing/2015/10/21/chartex" xmlns:cx3="http://schemas.microsoft.com/office/drawing/2016/5/9/chartex" xmlns:cx4="http://schemas.microsoft.com/office/drawing/2016/5/10/chartex" xmlns:cx5="http://schemas.microsoft.com/office/drawing/2016/5/11/chartex" xmlns:cx6="http://schemas.microsoft.com/office/drawing/2016/5/12/chartex" xmlns:cx7="http://schemas.microsoft.com/office/drawing/2016/5/13/chartex" xmlns:cx8="http://schemas.microsoft.com/office/drawing/2016/5/14/chartex" xmlns:mc="http://schemas.openxmlformats.org/markup-compatibility/2006" xmlns:aink="http://schemas.microsoft.com/office/drawing/2016/ink" xmlns:am3d="http://schemas.microsoft.com/office/drawing/2017/model3d" xmlns:o="urn:schemas-microsoft-com:office:office" xmlns:r="http://schemas.openxmlformats.org/officeDocument/2006/relationships" xmlns:m="http://schemas.openxmlformats.org/officeDocument/2006/math" xmlns:v="urn:schemas-microsoft-com:vml" xmlns:wp14="http://schemas.microsoft.com/office/word/2010/wordprocessingDrawing" xmlns:wp="http://schemas.openxmlformats.org/drawingml/2006/wordprocessingDrawing" xmlns:w10="urn:schemas-microsoft-com:office:word" xmlns:w="http://schemas.openxmlformats.org/wordprocessingml/2006/main" xmlns:w14="http://schemas.microsoft.com/office/word/2010/wordml" xmlns:w15="http://schemas.microsoft.com/office/word/2012/wordml" xmlns:w16cex="http://schemas.microsoft.com/office/word/2018/wordml/cex" xmlns:w16cid="http://schemas.microsoft.com/office/word/2016/wordml/cid" xmlns:w16="http://schemas.microsoft.com/office/word/2018/wordml" xmlns:w16sdtdh="http://schemas.microsoft.com/office/word/2020/wordml/sdtdatahash" xmlns:w16se="http://schemas.microsoft.com/office/word/2015/wordml/symex" xmlns:wpg="http://schemas.microsoft.com/office/word/2010/wordprocessingGroup" xmlns:wpi="http://schemas.microsoft.com/office/word/2010/wordprocessingInk" xmlns:wne="http://schemas.microsoft.com/office/word/2006/wordml" xmlns:wps="http://schemas.microsoft.com/office/word/2010/wordprocessingShape" mc:Ignorable="w14 w15 w16se w16cid w16 w16cex w16sdtdh wp14">
+<w:numbering xmlns:wpc="http://schemas.microsoft.com/office/word/2010/wordprocessingCanvas" xmlns:cx="http://schemas.microsoft.com/office/drawing/2014/chartex" xmlns:cx1="http://schemas.microsoft.com/office/drawing/2015/9/8/chartex" xmlns:cx2="http://schemas.microsoft.com/office/drawing/2015/10/21/chartex" xmlns:cx3="http://schemas.microsoft.com/office/drawing/2016/5/9/chartex" xmlns:cx4="http://schemas.microsoft.com/office/drawing/2016/5/10/chartex" xmlns:cx5="http://schemas.microsoft.com/office/drawing/2016/5/11/chartex" xmlns:cx6="http://schemas.microsoft.com/office/drawing/2016/5/12/chartex" xmlns:cx7="http://schemas.microsoft.com/office/drawing/2016/5/13/chartex" xmlns:cx8="http://schemas.microsoft.com/office/drawing/2016/5/14/chartex" xmlns:mc="http://schemas.openxmlformats.org/markup-compatibility/2006" xmlns:aink="http://schemas.microsoft.com/office/drawing/2016/ink" xmlns:am3d="http://schemas.microsoft.com/office/drawing/2017/model3d" xmlns:o="urn:schemas-microsoft-com:office:office" xmlns:oel="http://schemas.microsoft.com/office/2019/extlst" xmlns:r="http://schemas.openxmlformats.org/officeDocument/2006/relationships" xmlns:m="http://schemas.openxmlformats.org/officeDocument/2006/math" xmlns:v="urn:schemas-microsoft-com:vml" xmlns:wp14="http://schemas.microsoft.com/office/word/2010/wordprocessingDrawing" xmlns:wp="http://schemas.openxmlformats.org/drawingml/2006/wordprocessingDrawing" xmlns:w10="urn:schemas-microsoft-com:office:word" xmlns:w="http://schemas.openxmlformats.org/wordprocessingml/2006/main" xmlns:w14="http://schemas.microsoft.com/office/word/2010/wordml" xmlns:w15="http://schemas.microsoft.com/office/word/2012/wordml" xmlns:w16cei="http://schemas.microsoft.com/office/word/2026/wordml/cei" xmlns:w16cex="http://schemas.microsoft.com/office/word/2018/wordml/cex" xmlns:w16cid="http://schemas.microsoft.com/office/word/2016/wordml/cid" xmlns:w16="http://schemas.microsoft.com/office/word/2018/wordml" xmlns:w16du="http://schemas.microsoft.com/office/word/2023/wordml/word16du" xmlns:w16sdtdh="http://schemas.microsoft.com/office/word/2020/wordml/sdtdatahash" xmlns:w16sdtfl="http://schemas.microsoft.com/office/word/2024/wordml/sdtformatlock" xmlns:w16se="http://schemas.microsoft.com/office/word/2015/wordml/symex" xmlns:wpg="http://schemas.microsoft.com/office/word/2010/wordprocessingGroup" xmlns:wpi="http://schemas.microsoft.com/office/word/2010/wordprocessingInk" xmlns:wne="http://schemas.microsoft.com/office/word/2006/wordml" xmlns:wps="http://schemas.microsoft.com/office/word/2010/wordprocessingShape" mc:Ignorable="w14 w15 w16se w16cid w16 w16cex w16sdtdh w16sdtfl w16du wp14">
   <w:abstractNum w:abstractNumId="0" w15:restartNumberingAfterBreak="0">
     <w:nsid w:val="00000402"/>
     <w:multiLevelType w:val="multilevel"/>
@@ -6136,136 +6043,136 @@
       </w:pPr>
     </w:lvl>
   </w:abstractNum>
-  <w:num w:numId="1">
+  <w:num w:numId="1" w16cid:durableId="1517887032">
     <w:abstractNumId w:val="0"/>
   </w:num>
-  <w:num w:numId="2">
+  <w:num w:numId="2" w16cid:durableId="2080395801">
     <w:abstractNumId w:val="19"/>
   </w:num>
-  <w:num w:numId="3">
+  <w:num w:numId="3" w16cid:durableId="1526482393">
     <w:abstractNumId w:val="28"/>
   </w:num>
-  <w:num w:numId="4">
+  <w:num w:numId="4" w16cid:durableId="453600245">
     <w:abstractNumId w:val="5"/>
   </w:num>
-  <w:num w:numId="5">
+  <w:num w:numId="5" w16cid:durableId="1550144017">
     <w:abstractNumId w:val="41"/>
   </w:num>
-  <w:num w:numId="6">
+  <w:num w:numId="6" w16cid:durableId="336733414">
     <w:abstractNumId w:val="36"/>
   </w:num>
-  <w:num w:numId="7">
+  <w:num w:numId="7" w16cid:durableId="1704550758">
     <w:abstractNumId w:val="1"/>
   </w:num>
-  <w:num w:numId="8">
+  <w:num w:numId="8" w16cid:durableId="1475176917">
     <w:abstractNumId w:val="37"/>
   </w:num>
-  <w:num w:numId="9">
+  <w:num w:numId="9" w16cid:durableId="652678660">
     <w:abstractNumId w:val="23"/>
   </w:num>
-  <w:num w:numId="10">
+  <w:num w:numId="10" w16cid:durableId="735667030">
     <w:abstractNumId w:val="32"/>
   </w:num>
-  <w:num w:numId="11">
+  <w:num w:numId="11" w16cid:durableId="1123425781">
     <w:abstractNumId w:val="35"/>
   </w:num>
-  <w:num w:numId="12">
+  <w:num w:numId="12" w16cid:durableId="1109348459">
     <w:abstractNumId w:val="16"/>
   </w:num>
-  <w:num w:numId="13">
+  <w:num w:numId="13" w16cid:durableId="1692032107">
     <w:abstractNumId w:val="24"/>
   </w:num>
-  <w:num w:numId="14">
+  <w:num w:numId="14" w16cid:durableId="1044410392">
     <w:abstractNumId w:val="3"/>
   </w:num>
-  <w:num w:numId="15">
+  <w:num w:numId="15" w16cid:durableId="1504584660">
     <w:abstractNumId w:val="30"/>
   </w:num>
-  <w:num w:numId="16">
+  <w:num w:numId="16" w16cid:durableId="1801529202">
     <w:abstractNumId w:val="27"/>
   </w:num>
-  <w:num w:numId="17">
+  <w:num w:numId="17" w16cid:durableId="1057510324">
     <w:abstractNumId w:val="21"/>
   </w:num>
-  <w:num w:numId="18">
+  <w:num w:numId="18" w16cid:durableId="398330699">
     <w:abstractNumId w:val="39"/>
   </w:num>
-  <w:num w:numId="19">
+  <w:num w:numId="19" w16cid:durableId="937372931">
     <w:abstractNumId w:val="6"/>
   </w:num>
-  <w:num w:numId="20">
+  <w:num w:numId="20" w16cid:durableId="1804812270">
     <w:abstractNumId w:val="40"/>
   </w:num>
-  <w:num w:numId="21">
+  <w:num w:numId="21" w16cid:durableId="1548377106">
     <w:abstractNumId w:val="18"/>
   </w:num>
-  <w:num w:numId="22">
+  <w:num w:numId="22" w16cid:durableId="73012266">
     <w:abstractNumId w:val="22"/>
   </w:num>
-  <w:num w:numId="23">
+  <w:num w:numId="23" w16cid:durableId="1064372201">
     <w:abstractNumId w:val="9"/>
   </w:num>
-  <w:num w:numId="24">
+  <w:num w:numId="24" w16cid:durableId="748697740">
     <w:abstractNumId w:val="17"/>
   </w:num>
-  <w:num w:numId="25">
+  <w:num w:numId="25" w16cid:durableId="1162819894">
     <w:abstractNumId w:val="7"/>
   </w:num>
-  <w:num w:numId="26">
+  <w:num w:numId="26" w16cid:durableId="2065329011">
     <w:abstractNumId w:val="43"/>
   </w:num>
-  <w:num w:numId="27">
+  <w:num w:numId="27" w16cid:durableId="991253188">
     <w:abstractNumId w:val="29"/>
   </w:num>
-  <w:num w:numId="28">
+  <w:num w:numId="28" w16cid:durableId="1582836755">
     <w:abstractNumId w:val="38"/>
   </w:num>
-  <w:num w:numId="29">
+  <w:num w:numId="29" w16cid:durableId="1134248321">
     <w:abstractNumId w:val="8"/>
   </w:num>
-  <w:num w:numId="30">
+  <w:num w:numId="30" w16cid:durableId="1412115567">
     <w:abstractNumId w:val="42"/>
   </w:num>
-  <w:num w:numId="31">
+  <w:num w:numId="31" w16cid:durableId="505099112">
     <w:abstractNumId w:val="25"/>
   </w:num>
-  <w:num w:numId="32">
+  <w:num w:numId="32" w16cid:durableId="905458241">
     <w:abstractNumId w:val="2"/>
   </w:num>
-  <w:num w:numId="33">
+  <w:num w:numId="33" w16cid:durableId="129254653">
     <w:abstractNumId w:val="26"/>
   </w:num>
-  <w:num w:numId="34">
+  <w:num w:numId="34" w16cid:durableId="1718818085">
     <w:abstractNumId w:val="31"/>
   </w:num>
-  <w:num w:numId="35">
+  <w:num w:numId="35" w16cid:durableId="160581981">
     <w:abstractNumId w:val="34"/>
   </w:num>
-  <w:num w:numId="36">
+  <w:num w:numId="36" w16cid:durableId="1337458710">
     <w:abstractNumId w:val="12"/>
   </w:num>
-  <w:num w:numId="37">
+  <w:num w:numId="37" w16cid:durableId="1042826735">
     <w:abstractNumId w:val="33"/>
   </w:num>
-  <w:num w:numId="38">
+  <w:num w:numId="38" w16cid:durableId="1287274583">
     <w:abstractNumId w:val="11"/>
   </w:num>
-  <w:num w:numId="39">
+  <w:num w:numId="39" w16cid:durableId="250504543">
     <w:abstractNumId w:val="15"/>
   </w:num>
-  <w:num w:numId="40">
+  <w:num w:numId="40" w16cid:durableId="1715613746">
     <w:abstractNumId w:val="13"/>
   </w:num>
-  <w:num w:numId="41">
+  <w:num w:numId="41" w16cid:durableId="1613320161">
     <w:abstractNumId w:val="10"/>
   </w:num>
-  <w:num w:numId="42">
+  <w:num w:numId="42" w16cid:durableId="1975403035">
     <w:abstractNumId w:val="14"/>
   </w:num>
-  <w:num w:numId="43">
+  <w:num w:numId="43" w16cid:durableId="386152459">
     <w:abstractNumId w:val="20"/>
   </w:num>
-  <w:num w:numId="44">
+  <w:num w:numId="44" w16cid:durableId="608128740">
     <w:abstractNumId w:val="4"/>
   </w:num>
   <w:numIdMacAtCleanup w:val="43"/>
@@ -6273,7 +6180,7 @@
 </file>
 
 <file path=word/styles.xml><?xml version="1.0" encoding="utf-8"?>
-<w:styles xmlns:mc="http://schemas.openxmlformats.org/markup-compatibility/2006" xmlns:r="http://schemas.openxmlformats.org/officeDocument/2006/relationships" xmlns:w="http://schemas.openxmlformats.org/wordprocessingml/2006/main" xmlns:w14="http://schemas.microsoft.com/office/word/2010/wordml" xmlns:w15="http://schemas.microsoft.com/office/word/2012/wordml" xmlns:w16cex="http://schemas.microsoft.com/office/word/2018/wordml/cex" xmlns:w16cid="http://schemas.microsoft.com/office/word/2016/wordml/cid" xmlns:w16="http://schemas.microsoft.com/office/word/2018/wordml" xmlns:w16sdtdh="http://schemas.microsoft.com/office/word/2020/wordml/sdtdatahash" xmlns:w16se="http://schemas.microsoft.com/office/word/2015/wordml/symex" mc:Ignorable="w14 w15 w16se w16cid w16 w16cex w16sdtdh">
+<w:styles xmlns:mc="http://schemas.openxmlformats.org/markup-compatibility/2006" xmlns:r="http://schemas.openxmlformats.org/officeDocument/2006/relationships" xmlns:w="http://schemas.openxmlformats.org/wordprocessingml/2006/main" xmlns:w14="http://schemas.microsoft.com/office/word/2010/wordml" xmlns:w15="http://schemas.microsoft.com/office/word/2012/wordml" xmlns:w16cex="http://schemas.microsoft.com/office/word/2018/wordml/cex" xmlns:w16cid="http://schemas.microsoft.com/office/word/2016/wordml/cid" xmlns:w16="http://schemas.microsoft.com/office/word/2018/wordml" xmlns:w16du="http://schemas.microsoft.com/office/word/2023/wordml/word16du" xmlns:w16sdtdh="http://schemas.microsoft.com/office/word/2020/wordml/sdtdatahash" xmlns:w16sdtfl="http://schemas.microsoft.com/office/word/2024/wordml/sdtformatlock" xmlns:w16se="http://schemas.microsoft.com/office/word/2015/wordml/symex" mc:Ignorable="w14 w15 w16se w16cid w16 w16cex w16sdtdh w16sdtfl w16du">
   <w:docDefaults>
     <w:rPrDefault>
       <w:rPr>

</xml_diff>